<commit_message>
feat: update resume files and enhance skills section
- Updated binary files for the full-stack resume in PDF and DOCX formats.
- Revised the skills section in the MDX file to include Python under Languages and reorganized the Frontend skills for better clarity.
</commit_message>
<xml_diff>
--- a/apps/web/src/features/resume/wilsonchow_resume_v5_full-stack.docx
+++ b/apps/web/src/features/resume/wilsonchow_resume_v5_full-stack.docx
@@ -33,7 +33,7 @@
           <w:color w:val="4A4A4A"/>
           <w:sz w:val="19"/>
         </w:rPr>
-        <w:t>sinlongchow@gmail.com  ·  slchow.com  ·  linkedin.com/in/wilsonslchow  ·  github.com/ocwilsonchow</w:t>
+        <w:t>+852 6700 9180  ·  sinlongchow@gmail.com  ·  slchow.com  ·  linkedin.com/in/wilsonslchow  ·  github.com/ocwilsonchow</w:t>
       </w:r>
     </w:p>
     <w:p>
@@ -2420,6 +2420,31 @@
           <w:color w:val="1A1A1A"/>
           <w:sz w:val="19"/>
         </w:rPr>
+        <w:t xml:space="preserve">Languages: </w:t>
+      </w:r>
+      <w:r>
+        <w:rPr>
+          <w:rFonts w:ascii="Calibri" w:hAnsi="Calibri" w:eastAsia="Calibri" w:cs="Calibri"/>
+          <w:b w:val="0"/>
+          <w:color w:val="1A1A1A"/>
+          <w:sz w:val="19"/>
+        </w:rPr>
+        <w:t>TypeScript, Python</w:t>
+      </w:r>
+    </w:p>
+    <w:p>
+      <w:pPr>
+        <w:keepNext w:val="0"/>
+        <w:pageBreakBefore w:val="0"/>
+        <w:spacing w:before="0" w:after="8" w:line="240" w:lineRule="auto"/>
+      </w:pPr>
+      <w:r>
+        <w:rPr>
+          <w:rFonts w:ascii="Calibri" w:hAnsi="Calibri" w:eastAsia="Calibri" w:cs="Calibri"/>
+          <w:b/>
+          <w:color w:val="1A1A1A"/>
+          <w:sz w:val="19"/>
+        </w:rPr>
         <w:t xml:space="preserve">Frontend: </w:t>
       </w:r>
       <w:r>
@@ -2429,7 +2454,7 @@
           <w:color w:val="1A1A1A"/>
           <w:sz w:val="19"/>
         </w:rPr>
-        <w:t>TypeScript, React, Next.js, React Native, Tailwind CSS, shadcn/ui, Figma, Zustand, Redux, TipTap</w:t>
+        <w:t>React, Next.js, React Native, Tailwind CSS, shadcn/ui, Figma, Zustand, Redux, TipTap</w:t>
       </w:r>
     </w:p>
     <w:p>

</xml_diff>

<commit_message>
feat: update resume files and enhance content in MDX
- Updated binary files for the full-stack resume in PDF and DOCX formats.
- Revised the MDX file to improve the description of RAG features and added details about the custom input component published on npm.
</commit_message>
<xml_diff>
--- a/apps/web/src/features/resume/wilsonchow_resume_v5_full-stack.docx
+++ b/apps/web/src/features/resume/wilsonchow_resume_v5_full-stack.docx
@@ -834,7 +834,7 @@
           <w:color w:val="1A1A1A"/>
           <w:sz w:val="19"/>
         </w:rPr>
-        <w:t>Mastra workflows</w:t>
+        <w:t>workflows</w:t>
       </w:r>
       <w:r>
         <w:rPr>
@@ -843,7 +843,43 @@
           <w:color w:val="1A1A1A"/>
           <w:sz w:val="19"/>
         </w:rPr>
-        <w:t xml:space="preserve">, memory, schedules, tools, pause/resume, retries, sandboxing, and skills; </w:t>
+        <w:t xml:space="preserve">, </w:t>
+      </w:r>
+      <w:r>
+        <w:rPr>
+          <w:rFonts w:ascii="Calibri" w:hAnsi="Calibri" w:eastAsia="Calibri" w:cs="Calibri"/>
+          <w:b/>
+          <w:color w:val="1A1A1A"/>
+          <w:sz w:val="19"/>
+        </w:rPr>
+        <w:t>memory systems</w:t>
+      </w:r>
+      <w:r>
+        <w:rPr>
+          <w:rFonts w:ascii="Calibri" w:hAnsi="Calibri" w:eastAsia="Calibri" w:cs="Calibri"/>
+          <w:b w:val="0"/>
+          <w:color w:val="1A1A1A"/>
+          <w:sz w:val="19"/>
+        </w:rPr>
+        <w:t xml:space="preserve">, schedules, tools, pause/resume, retries, sandboxing, and skills in </w:t>
+      </w:r>
+      <w:r>
+        <w:rPr>
+          <w:rFonts w:ascii="Calibri" w:hAnsi="Calibri" w:eastAsia="Calibri" w:cs="Calibri"/>
+          <w:b/>
+          <w:color w:val="1A1A1A"/>
+          <w:sz w:val="19"/>
+        </w:rPr>
+        <w:t>Mastra</w:t>
+      </w:r>
+      <w:r>
+        <w:rPr>
+          <w:rFonts w:ascii="Calibri" w:hAnsi="Calibri" w:eastAsia="Calibri" w:cs="Calibri"/>
+          <w:b w:val="0"/>
+          <w:color w:val="1A1A1A"/>
+          <w:sz w:val="19"/>
+        </w:rPr>
+        <w:t xml:space="preserve">; </w:t>
       </w:r>
       <w:r>
         <w:rPr>
@@ -862,6 +898,159 @@
           <w:sz w:val="19"/>
         </w:rPr>
         <w:t xml:space="preserve"> for observability.</w:t>
+      </w:r>
+    </w:p>
+    <w:p>
+      <w:pPr>
+        <w:pStyle w:val="ListBullet"/>
+        <w:keepNext w:val="0"/>
+        <w:pageBreakBefore w:val="0"/>
+        <w:spacing w:before="0" w:after="8" w:line="240" w:lineRule="auto"/>
+        <w:ind w:left="288"/>
+      </w:pPr>
+      <w:r>
+        <w:rPr>
+          <w:rFonts w:ascii="Calibri" w:hAnsi="Calibri" w:eastAsia="Calibri" w:cs="Calibri"/>
+          <w:b/>
+          <w:color w:val="1A1A1A"/>
+          <w:sz w:val="19"/>
+        </w:rPr>
+        <w:t>RAG</w:t>
+      </w:r>
+      <w:r>
+        <w:rPr>
+          <w:rFonts w:ascii="Calibri" w:hAnsi="Calibri" w:eastAsia="Calibri" w:cs="Calibri"/>
+          <w:b w:val="0"/>
+          <w:color w:val="1A1A1A"/>
+          <w:sz w:val="19"/>
+        </w:rPr>
+        <w:t xml:space="preserve">: </w:t>
+      </w:r>
+      <w:r>
+        <w:rPr>
+          <w:rFonts w:ascii="Calibri" w:hAnsi="Calibri" w:eastAsia="Calibri" w:cs="Calibri"/>
+          <w:b/>
+          <w:color w:val="1A1A1A"/>
+          <w:sz w:val="19"/>
+        </w:rPr>
+        <w:t>structure-aware</w:t>
+      </w:r>
+      <w:r>
+        <w:rPr>
+          <w:rFonts w:ascii="Calibri" w:hAnsi="Calibri" w:eastAsia="Calibri" w:cs="Calibri"/>
+          <w:b w:val="0"/>
+          <w:color w:val="1A1A1A"/>
+          <w:sz w:val="19"/>
+        </w:rPr>
+        <w:t xml:space="preserve"> parsing and chunking, </w:t>
+      </w:r>
+      <w:r>
+        <w:rPr>
+          <w:rFonts w:ascii="Calibri" w:hAnsi="Calibri" w:eastAsia="Calibri" w:cs="Calibri"/>
+          <w:b/>
+          <w:color w:val="1A1A1A"/>
+          <w:sz w:val="19"/>
+        </w:rPr>
+        <w:t>metadata creation</w:t>
+      </w:r>
+      <w:r>
+        <w:rPr>
+          <w:rFonts w:ascii="Calibri" w:hAnsi="Calibri" w:eastAsia="Calibri" w:cs="Calibri"/>
+          <w:b w:val="0"/>
+          <w:color w:val="1A1A1A"/>
+          <w:sz w:val="19"/>
+        </w:rPr>
+        <w:t xml:space="preserve">, </w:t>
+      </w:r>
+      <w:r>
+        <w:rPr>
+          <w:rFonts w:ascii="Calibri" w:hAnsi="Calibri" w:eastAsia="Calibri" w:cs="Calibri"/>
+          <w:b/>
+          <w:color w:val="1A1A1A"/>
+          <w:sz w:val="19"/>
+        </w:rPr>
+        <w:t>retrieval funneling</w:t>
+      </w:r>
+      <w:r>
+        <w:rPr>
+          <w:rFonts w:ascii="Calibri" w:hAnsi="Calibri" w:eastAsia="Calibri" w:cs="Calibri"/>
+          <w:b w:val="0"/>
+          <w:color w:val="1A1A1A"/>
+          <w:sz w:val="19"/>
+        </w:rPr>
+        <w:t xml:space="preserve"> with </w:t>
+      </w:r>
+      <w:r>
+        <w:rPr>
+          <w:rFonts w:ascii="Calibri" w:hAnsi="Calibri" w:eastAsia="Calibri" w:cs="Calibri"/>
+          <w:b/>
+          <w:color w:val="1A1A1A"/>
+          <w:sz w:val="19"/>
+        </w:rPr>
+        <w:t>Pinecone hybrid search</w:t>
+      </w:r>
+      <w:r>
+        <w:rPr>
+          <w:rFonts w:ascii="Calibri" w:hAnsi="Calibri" w:eastAsia="Calibri" w:cs="Calibri"/>
+          <w:b w:val="0"/>
+          <w:color w:val="1A1A1A"/>
+          <w:sz w:val="19"/>
+        </w:rPr>
+        <w:t xml:space="preserve"> (dense and sparse vectors, BM25) and reranking; </w:t>
+      </w:r>
+      <w:r>
+        <w:rPr>
+          <w:rFonts w:ascii="Calibri" w:hAnsi="Calibri" w:eastAsia="Calibri" w:cs="Calibri"/>
+          <w:b/>
+          <w:color w:val="1A1A1A"/>
+          <w:sz w:val="19"/>
+        </w:rPr>
+        <w:t>SQL agent</w:t>
+      </w:r>
+      <w:r>
+        <w:rPr>
+          <w:rFonts w:ascii="Calibri" w:hAnsi="Calibri" w:eastAsia="Calibri" w:cs="Calibri"/>
+          <w:b w:val="0"/>
+          <w:color w:val="1A1A1A"/>
+          <w:sz w:val="19"/>
+        </w:rPr>
+        <w:t xml:space="preserve"> for experimental data analysis.</w:t>
+      </w:r>
+    </w:p>
+    <w:p>
+      <w:pPr>
+        <w:pStyle w:val="ListBullet"/>
+        <w:keepNext w:val="0"/>
+        <w:pageBreakBefore w:val="0"/>
+        <w:spacing w:before="0" w:after="8" w:line="240" w:lineRule="auto"/>
+        <w:ind w:left="288"/>
+      </w:pPr>
+      <w:r>
+        <w:rPr>
+          <w:rFonts w:ascii="Calibri" w:hAnsi="Calibri" w:eastAsia="Calibri" w:cs="Calibri"/>
+          <w:b w:val="0"/>
+          <w:color w:val="1A1A1A"/>
+          <w:sz w:val="19"/>
+        </w:rPr>
+        <w:t xml:space="preserve">Enforced document-level permissions with </w:t>
+      </w:r>
+      <w:r>
+        <w:rPr>
+          <w:rFonts w:ascii="Calibri" w:hAnsi="Calibri" w:eastAsia="Calibri" w:cs="Calibri"/>
+          <w:b/>
+          <w:color w:val="1A1A1A"/>
+          <w:sz w:val="19"/>
+        </w:rPr>
+        <w:t>ABAC</w:t>
+      </w:r>
+      <w:r>
+        <w:rPr>
+          <w:rFonts w:ascii="Calibri" w:hAnsi="Calibri" w:eastAsia="Calibri" w:cs="Calibri"/>
+          <w:b w:val="0"/>
+          <w:color w:val="1A1A1A"/>
+          <w:sz w:val="19"/>
+        </w:rPr>
+        <w:t xml:space="preserve"> based on document ownership and user roles and access levels.</w:t>
       </w:r>
     </w:p>
     <w:p>
@@ -1001,69 +1190,6 @@
       <w:r>
         <w:rPr>
           <w:rFonts w:ascii="Calibri" w:hAnsi="Calibri" w:eastAsia="Calibri" w:cs="Calibri"/>
-          <w:b/>
-          <w:color w:val="1A1A1A"/>
-          <w:sz w:val="19"/>
-        </w:rPr>
-        <w:t>RAG</w:t>
-      </w:r>
-      <w:r>
-        <w:rPr>
-          <w:rFonts w:ascii="Calibri" w:hAnsi="Calibri" w:eastAsia="Calibri" w:cs="Calibri"/>
-          <w:b w:val="0"/>
-          <w:color w:val="1A1A1A"/>
-          <w:sz w:val="19"/>
-        </w:rPr>
-        <w:t xml:space="preserve"> (ingestion, parsing, embedding, </w:t>
-      </w:r>
-      <w:r>
-        <w:rPr>
-          <w:rFonts w:ascii="Calibri" w:hAnsi="Calibri" w:eastAsia="Calibri" w:cs="Calibri"/>
-          <w:b/>
-          <w:color w:val="1A1A1A"/>
-          <w:sz w:val="19"/>
-        </w:rPr>
-        <w:t>Pinecone</w:t>
-      </w:r>
-      <w:r>
-        <w:rPr>
-          <w:rFonts w:ascii="Calibri" w:hAnsi="Calibri" w:eastAsia="Calibri" w:cs="Calibri"/>
-          <w:b w:val="0"/>
-          <w:color w:val="1A1A1A"/>
-          <w:sz w:val="19"/>
-        </w:rPr>
-        <w:t xml:space="preserve"> query/reranking); also built an </w:t>
-      </w:r>
-      <w:r>
-        <w:rPr>
-          <w:rFonts w:ascii="Calibri" w:hAnsi="Calibri" w:eastAsia="Calibri" w:cs="Calibri"/>
-          <w:b/>
-          <w:color w:val="1A1A1A"/>
-          <w:sz w:val="19"/>
-        </w:rPr>
-        <w:t>SQL agent</w:t>
-      </w:r>
-      <w:r>
-        <w:rPr>
-          <w:rFonts w:ascii="Calibri" w:hAnsi="Calibri" w:eastAsia="Calibri" w:cs="Calibri"/>
-          <w:b w:val="0"/>
-          <w:color w:val="1A1A1A"/>
-          <w:sz w:val="19"/>
-        </w:rPr>
-        <w:t xml:space="preserve"> for experimental data analysis.</w:t>
-      </w:r>
-    </w:p>
-    <w:p>
-      <w:pPr>
-        <w:pStyle w:val="ListBullet"/>
-        <w:keepNext w:val="0"/>
-        <w:pageBreakBefore w:val="0"/>
-        <w:spacing w:before="0" w:after="8" w:line="240" w:lineRule="auto"/>
-        <w:ind w:left="288"/>
-      </w:pPr>
-      <w:r>
-        <w:rPr>
-          <w:rFonts w:ascii="Calibri" w:hAnsi="Calibri" w:eastAsia="Calibri" w:cs="Calibri"/>
           <w:b w:val="0"/>
           <w:color w:val="1A1A1A"/>
           <w:sz w:val="19"/>
@@ -1086,7 +1212,25 @@
           <w:color w:val="1A1A1A"/>
           <w:sz w:val="19"/>
         </w:rPr>
-        <w:t xml:space="preserve"> input component for attaching workspace files to messages.</w:t>
+        <w:t xml:space="preserve"> input component for attaching workspace files to messages (published on npm as </w:t>
+      </w:r>
+      <w:r>
+        <w:rPr>
+          <w:rFonts w:ascii="Calibri" w:hAnsi="Calibri" w:eastAsia="Calibri" w:cs="Calibri"/>
+          <w:b/>
+          <w:color w:val="1A1A1A"/>
+          <w:sz w:val="19"/>
+        </w:rPr>
+        <w:t>@ocwilsonchow/editor</w:t>
+      </w:r>
+      <w:r>
+        <w:rPr>
+          <w:rFonts w:ascii="Calibri" w:hAnsi="Calibri" w:eastAsia="Calibri" w:cs="Calibri"/>
+          <w:b w:val="0"/>
+          <w:color w:val="1A1A1A"/>
+          <w:sz w:val="19"/>
+        </w:rPr>
+        <w:t>).</w:t>
       </w:r>
     </w:p>
     <w:p>

</xml_diff>

<commit_message>
feat: update resume files and refine AI section in MDX
- Updated binary files for the full-stack resume in PDF and DOCX formats.
- Revised the MDX file to enhance the AI section, replacing "Docling" with "Docling" for improved accuracy.
</commit_message>
<xml_diff>
--- a/apps/web/src/features/resume/wilsonchow_resume_v5_full-stack.docx
+++ b/apps/web/src/features/resume/wilsonchow_resume_v5_full-stack.docx
@@ -1212,7 +1212,7 @@
           <w:color w:val="1A1A1A"/>
           <w:sz w:val="19"/>
         </w:rPr>
-        <w:t xml:space="preserve"> input component for attaching workspace files to messages (published on npm as </w:t>
+        <w:t xml:space="preserve"> input for attaching workspace files (npm: </w:t>
       </w:r>
       <w:r>
         <w:rPr>
@@ -2723,7 +2723,7 @@
           <w:color w:val="1A1A1A"/>
           <w:sz w:val="19"/>
         </w:rPr>
-        <w:t>Mastra, Vercel AI SDK, LangChain, Pinecone, Strands, AWS Bedrock, Mem0, Langfuse</w:t>
+        <w:t>Mastra, Vercel AI SDK, LangChain, Pinecone, Docling, Strands, AWS Bedrock, Mem0, Langfuse</w:t>
       </w:r>
     </w:p>
     <w:p>
@@ -2919,7 +2919,7 @@
           <w:color w:val="1A1A1A"/>
           <w:sz w:val="19"/>
         </w:rPr>
-        <w:t>Master of Pharmacy (MPharm, undergraduate) — First Class Honours</w:t>
+        <w:t>MPharm Pharmacy (undergraduate) - First Class Honours</w:t>
       </w:r>
     </w:p>
     <w:p>

</xml_diff>